<commit_message>
chore: image-gen fixes + reconcile improvements
- Fix: paper 7ff3b4334aa1 generated full but no images (ImageGenJob never enqueued)
- Root cause: generate_stream image enqueue block skipped silently
- Manual fix: enqueued 3 jobs → worker completed (stunting_reduction.jpg, conceptual_framework.jpg, research_flow.jpg)
- reconcile_figure_images now patches legacy figures[] array with correct Path/filename/url/hasImage
- _reconcile_section_images: added Strategy 0 (semantic match via ImageGenJob.target_path)
- Jobs auto-commit image jobs with target_path derived from figure metadata

Files:
- backend/tools/paperfull/jobs.py: +Strategy 0 semantic match, target_path tracking
- backend/tools/image_generation/reconcile.py: patch figures[] array
</commit_message>
<xml_diff>
--- a/backend/tools/Journal/AEJ_output.docx
+++ b/backend/tools/Journal/AEJ_output.docx
@@ -380,41 +380,58 @@
                 <w:vertAlign w:val="baseline"/>
                 <w:rtl w:val="0"/>
               </w:rPr>
+              <w:t xml:space="preserve">Test Table in 2-Column AEJ</w:t>
+            </w:r>
+            <w:r>
+              <w:rPr>
+                <w:rtl w:val="0"/>
+              </w:rPr>
+            </w:r>
+          </w:p>
+          <w:p>
+            <w:pPr>
+              <w:rPr>
+                <w:rFonts w:ascii="Calibri" w:cs="Calibri" w:eastAsia="Calibri" w:hAnsi="Calibri"/>
+                <w:vertAlign w:val="baseline"/>
+              </w:rPr>
+            </w:pPr>
+            <w:r>
+              <w:rPr>
+                <w:rtl w:val="0"/>
+              </w:rPr>
+              <w:t xml:space="preserve">Test Author</w:t>
+            </w:r>
+          </w:p>
+          <w:p>
+            <w:pPr>
+              <w:rPr>
+                <w:rFonts w:ascii="Calibri" w:cs="Calibri" w:eastAsia="Calibri" w:hAnsi="Calibri"/>
+                <w:vertAlign w:val="baseline"/>
+              </w:rPr>
+            </w:pPr>
+            <w:r>
+              <w:rPr>
+                <w:rFonts w:ascii="Calibri" w:cs="Calibri" w:eastAsia="Calibri" w:hAnsi="Calibri"/>
+                <w:vertAlign w:val="baseline"/>
+                <w:rtl w:val="0"/>
+              </w:rPr>
+              <w:t xml:space="preserve">UTM</w:t>
+            </w:r>
+            <w:r>
+              <w:rPr>
+                <w:rFonts w:ascii="Calibri" w:cs="Calibri" w:eastAsia="Calibri" w:hAnsi="Calibri"/>
+                <w:vertAlign w:val="superscript"/>
+                <w:rtl w:val="0"/>
+              </w:rPr>
               <w:t xml:space="preserve"/>
             </w:r>
             <w:r>
               <w:rPr>
-                <w:rtl w:val="0"/>
-              </w:rPr>
-            </w:r>
-          </w:p>
-          <w:p>
-            <w:pPr>
-              <w:rPr>
-                <w:rFonts w:ascii="Calibri" w:cs="Calibri" w:eastAsia="Calibri" w:hAnsi="Calibri"/>
-                <w:vertAlign w:val="baseline"/>
-              </w:rPr>
-            </w:pPr>
-            <w:r>
-              <w:rPr>
-                <w:rtl w:val="0"/>
-              </w:rPr>
-            </w:r>
-          </w:p>
-          <w:p>
-            <w:pPr>
-              <w:rPr>
-                <w:rFonts w:ascii="Calibri" w:cs="Calibri" w:eastAsia="Calibri" w:hAnsi="Calibri"/>
-                <w:vertAlign w:val="baseline"/>
-              </w:rPr>
-            </w:pPr>
-            <w:r>
-              <w:rPr>
-                <w:rFonts w:ascii="Calibri" w:cs="Calibri" w:eastAsia="Calibri" w:hAnsi="Calibri"/>
-                <w:vertAlign w:val="baseline"/>
-                <w:rtl w:val="0"/>
-              </w:rPr>
-              <w:t xml:space="preserve">Azizul Udinekov</w:t>
+                <w:rFonts w:ascii="Calibri" w:cs="Calibri" w:eastAsia="Calibri" w:hAnsi="Calibri"/>
+                <w:vertAlign w:val="baseline"/>
+                <w:rtl w:val="0"/>
+              </w:rPr>
+              <w:t xml:space="preserve"/>
             </w:r>
             <w:r>
               <w:rPr>
@@ -422,15 +439,15 @@
                 <w:vertAlign w:val="superscript"/>
                 <w:rtl w:val="0"/>
               </w:rPr>
-              <w:t xml:space="preserve">a</w:t>
-            </w:r>
-            <w:r>
-              <w:rPr>
-                <w:rFonts w:ascii="Calibri" w:cs="Calibri" w:eastAsia="Calibri" w:hAnsi="Calibri"/>
-                <w:vertAlign w:val="baseline"/>
-                <w:rtl w:val="0"/>
-              </w:rPr>
-              <w:t xml:space="preserve">*, Ungku Rizlan Ungku Ahmad</w:t>
+              <w:t xml:space="preserve"/>
+            </w:r>
+            <w:r>
+              <w:rPr>
+                <w:rFonts w:ascii="Calibri" w:cs="Calibri" w:eastAsia="Calibri" w:hAnsi="Calibri"/>
+                <w:vertAlign w:val="baseline"/>
+                <w:rtl w:val="0"/>
+              </w:rPr>
+              <w:t xml:space="preserve"/>
             </w:r>
             <w:r>
               <w:rPr>
@@ -438,41 +455,26 @@
                 <w:vertAlign w:val="superscript"/>
                 <w:rtl w:val="0"/>
               </w:rPr>
-              <w:t xml:space="preserve">b*</w:t>
-            </w:r>
-            <w:r>
-              <w:rPr>
-                <w:rFonts w:ascii="Calibri" w:cs="Calibri" w:eastAsia="Calibri" w:hAnsi="Calibri"/>
-                <w:vertAlign w:val="baseline"/>
-                <w:rtl w:val="0"/>
-              </w:rPr>
-              <w:t xml:space="preserve">, Muhammad Ekbar, Mohd Azmi Hj Shamsuri</w:t>
-            </w:r>
-            <w:r>
-              <w:rPr>
-                <w:rFonts w:ascii="Calibri" w:cs="Calibri" w:eastAsia="Calibri" w:hAnsi="Calibri"/>
-                <w:vertAlign w:val="superscript"/>
-                <w:rtl w:val="0"/>
-              </w:rPr>
-              <w:t xml:space="preserve">a</w:t>
-            </w:r>
-            <w:r>
-              <w:rPr>
-                <w:rtl w:val="0"/>
-              </w:rPr>
-            </w:r>
-          </w:p>
-          <w:p>
-            <w:pPr>
-              <w:rPr>
-                <w:rFonts w:ascii="Calibri" w:cs="Calibri" w:eastAsia="Calibri" w:hAnsi="Calibri"/>
-                <w:vertAlign w:val="baseline"/>
-              </w:rPr>
-            </w:pPr>
-            <w:r>
-              <w:rPr>
-                <w:rtl w:val="0"/>
-              </w:rPr>
+              <w:t xml:space="preserve"/>
+            </w:r>
+            <w:r>
+              <w:rPr>
+                <w:rtl w:val="0"/>
+              </w:rPr>
+            </w:r>
+          </w:p>
+          <w:p>
+            <w:pPr>
+              <w:rPr>
+                <w:rFonts w:ascii="Calibri" w:cs="Calibri" w:eastAsia="Calibri" w:hAnsi="Calibri"/>
+                <w:vertAlign w:val="baseline"/>
+              </w:rPr>
+            </w:pPr>
+            <w:r>
+              <w:rPr>
+                <w:rtl w:val="0"/>
+              </w:rPr>
+              <w:t xml:space="preserve">test@utm.my</w:t>
             </w:r>
           </w:p>
         </w:tc>
@@ -1112,7 +1114,7 @@
                 <w:vertAlign w:val="baseline"/>
                 <w:rtl w:val="0"/>
               </w:rPr>
-              <w:t xml:space="preserve"/>
+              <w:t xml:space="preserve">Testing table rendering in 2-column layout.</w:t>
             </w:r>
             <w:r>
               <w:rPr>
@@ -1159,7 +1161,7 @@
                 <w:vertAlign w:val="baseline"/>
                 <w:rtl w:val="0"/>
               </w:rPr>
-              <w:t xml:space="preserve"/>
+              <w:t xml:space="preserve">Keywords</w:t>
             </w:r>
             <w:r>
               <w:rPr>
@@ -1169,7 +1171,7 @@
                 <w:vertAlign w:val="baseline"/>
                 <w:rtl w:val="0"/>
               </w:rPr>
-              <w:t xml:space="preserve"/>
+              <w:t xml:space="preserve">: test, table.</w:t>
             </w:r>
             <w:r>
               <w:rPr>
@@ -1372,7 +1374,434 @@
       </w:pPr>
     </w:p>
     <w:p>
-      <w:pPr/>
+      <w:pPr>
+        <w:spacing w:before="0" w:after="0" w:line="240" w:lineRule="auto"/>
+        <w:jc w:val="left"/>
+      </w:pPr>
+      <w:r>
+        <w:rPr>
+          <w:rFonts w:ascii="Calibri" w:hAnsi="Calibri" w:cs="Calibri"/>
+          <w:b/>
+          <w:color w:val="943634"/>
+          <w:sz w:val="22"/>
+        </w:rPr>
+        <w:t>INTRODUCTION</w:t>
+      </w:r>
+    </w:p>
+    <w:p>
+      <w:pPr>
+        <w:spacing w:before="0" w:after="0" w:line="240" w:lineRule="auto"/>
+        <w:jc w:val="both"/>
+        <w:ind w:firstLine="182"/>
+      </w:pPr>
+      <w:r>
+        <w:rPr>
+          <w:rFonts w:ascii="Calibri" w:hAnsi="Calibri" w:cs="Calibri"/>
+          <w:sz w:val="18"/>
+        </w:rPr>
+        <w:t>Here is a table:</w:t>
+      </w:r>
+    </w:p>
+    <w:p>
+      <w:pPr>
+        <w:spacing w:before="60" w:after="0" w:line="240" w:lineRule="auto"/>
+        <w:jc w:val="center"/>
+      </w:pPr>
+      <w:r>
+        <w:rPr>
+          <w:rFonts w:ascii="Calibri" w:hAnsi="Calibri" w:cs="Calibri"/>
+          <w:b/>
+          <w:sz w:val="16"/>
+        </w:rPr>
+        <w:t xml:space="preserve">Table 1. </w:t>
+      </w:r>
+      <w:r>
+        <w:rPr>
+          <w:rFonts w:ascii="Calibri" w:hAnsi="Calibri" w:cs="Calibri"/>
+          <w:sz w:val="16"/>
+        </w:rPr>
+        <w:t>Comparison Results</w:t>
+      </w:r>
+    </w:p>
+    <w:tbl>
+      <w:tblPr>
+        <w:tblW w:type="pct" w:w="5000"/>
+        <w:jc w:val="center"/>
+        <w:tblLook w:firstColumn="1" w:firstRow="1" w:lastColumn="0" w:lastRow="0" w:noHBand="0" w:noVBand="1" w:val="04A0"/>
+        <w:tblBorders>
+          <w:top w:val="single" w:sz="4" w:space="0" w:color="000000"/>
+          <w:left w:val="nil" w:sz="0" w:space="0" w:color="000000"/>
+          <w:bottom w:val="nil" w:sz="0" w:space="0" w:color="000000"/>
+          <w:right w:val="nil" w:sz="0" w:space="0" w:color="000000"/>
+          <w:insideH w:val="nil" w:sz="0" w:space="0" w:color="000000"/>
+          <w:insideV w:val="nil" w:sz="0" w:space="0" w:color="000000"/>
+        </w:tblBorders>
+        <w:tblLayout w:type="fixed"/>
+      </w:tblPr>
+      <w:tblGrid>
+        <w:gridCol w:w="3351"/>
+        <w:gridCol w:w="3351"/>
+        <w:gridCol w:w="3351"/>
+      </w:tblGrid>
+      <w:tr>
+        <w:tc>
+          <w:tcPr>
+            <w:tcW w:type="dxa" w:w="3351"/>
+            <w:tcBorders>
+              <w:top w:val="single" w:sz="4" w:space="0" w:color="auto"/>
+              <w:bottom w:val="single" w:sz="4" w:space="0" w:color="auto"/>
+              <w:left w:val="none" w:sz="0" w:space="0" w:color="auto"/>
+              <w:right w:val="none" w:sz="0" w:space="0" w:color="auto"/>
+            </w:tcBorders>
+          </w:tcPr>
+          <w:p>
+            <w:pPr>
+              <w:spacing w:before="0" w:after="0" w:line="240" w:lineRule="auto"/>
+              <w:jc w:val="center"/>
+            </w:pPr>
+            <w:r/>
+            <w:r>
+              <w:rPr>
+                <w:rFonts w:ascii="Calibri" w:hAnsi="Calibri" w:cs="Calibri"/>
+                <w:b/>
+                <w:sz w:val="16"/>
+              </w:rPr>
+              <w:t>Method</w:t>
+            </w:r>
+          </w:p>
+        </w:tc>
+        <w:tc>
+          <w:tcPr>
+            <w:tcW w:type="dxa" w:w="3351"/>
+            <w:tcBorders>
+              <w:top w:val="single" w:sz="4" w:space="0" w:color="auto"/>
+              <w:bottom w:val="single" w:sz="4" w:space="0" w:color="auto"/>
+              <w:left w:val="none" w:sz="0" w:space="0" w:color="auto"/>
+              <w:right w:val="none" w:sz="0" w:space="0" w:color="auto"/>
+            </w:tcBorders>
+          </w:tcPr>
+          <w:p>
+            <w:pPr>
+              <w:spacing w:before="0" w:after="0" w:line="240" w:lineRule="auto"/>
+              <w:jc w:val="center"/>
+            </w:pPr>
+            <w:r/>
+            <w:r>
+              <w:rPr>
+                <w:rFonts w:ascii="Calibri" w:hAnsi="Calibri" w:cs="Calibri"/>
+                <w:b/>
+                <w:sz w:val="16"/>
+              </w:rPr>
+              <w:t>Accuracy</w:t>
+            </w:r>
+          </w:p>
+        </w:tc>
+        <w:tc>
+          <w:tcPr>
+            <w:tcW w:type="dxa" w:w="3351"/>
+            <w:tcBorders>
+              <w:top w:val="single" w:sz="4" w:space="0" w:color="auto"/>
+              <w:bottom w:val="single" w:sz="4" w:space="0" w:color="auto"/>
+              <w:left w:val="none" w:sz="0" w:space="0" w:color="auto"/>
+              <w:right w:val="none" w:sz="0" w:space="0" w:color="auto"/>
+            </w:tcBorders>
+          </w:tcPr>
+          <w:p>
+            <w:pPr>
+              <w:spacing w:before="0" w:after="0" w:line="240" w:lineRule="auto"/>
+              <w:jc w:val="center"/>
+            </w:pPr>
+            <w:r/>
+            <w:r>
+              <w:rPr>
+                <w:rFonts w:ascii="Calibri" w:hAnsi="Calibri" w:cs="Calibri"/>
+                <w:b/>
+                <w:sz w:val="16"/>
+              </w:rPr>
+              <w:t>Speed</w:t>
+            </w:r>
+          </w:p>
+        </w:tc>
+      </w:tr>
+      <w:tr>
+        <w:tc>
+          <w:tcPr>
+            <w:tcW w:type="dxa" w:w="3351"/>
+            <w:tcBorders>
+              <w:top w:val="single" w:sz="4" w:space="0" w:color="auto"/>
+              <w:bottom w:val="single" w:sz="4" w:space="0" w:color="auto"/>
+              <w:left w:val="none" w:sz="0" w:space="0" w:color="auto"/>
+              <w:right w:val="none" w:sz="0" w:space="0" w:color="auto"/>
+            </w:tcBorders>
+          </w:tcPr>
+          <w:p>
+            <w:pPr>
+              <w:spacing w:before="0" w:after="0" w:line="240" w:lineRule="auto"/>
+              <w:jc w:val="center"/>
+            </w:pPr>
+            <w:r/>
+            <w:r>
+              <w:rPr>
+                <w:rFonts w:ascii="Calibri" w:hAnsi="Calibri" w:cs="Calibri"/>
+                <w:sz w:val="16"/>
+              </w:rPr>
+              <w:t>A</w:t>
+            </w:r>
+          </w:p>
+        </w:tc>
+        <w:tc>
+          <w:tcPr>
+            <w:tcW w:type="dxa" w:w="3351"/>
+            <w:tcBorders>
+              <w:top w:val="single" w:sz="4" w:space="0" w:color="auto"/>
+              <w:bottom w:val="single" w:sz="4" w:space="0" w:color="auto"/>
+              <w:left w:val="none" w:sz="0" w:space="0" w:color="auto"/>
+              <w:right w:val="none" w:sz="0" w:space="0" w:color="auto"/>
+            </w:tcBorders>
+          </w:tcPr>
+          <w:p>
+            <w:pPr>
+              <w:spacing w:before="0" w:after="0" w:line="240" w:lineRule="auto"/>
+              <w:jc w:val="center"/>
+            </w:pPr>
+            <w:r/>
+            <w:r>
+              <w:rPr>
+                <w:rFonts w:ascii="Calibri" w:hAnsi="Calibri" w:cs="Calibri"/>
+                <w:sz w:val="16"/>
+              </w:rPr>
+              <w:t>95%</w:t>
+            </w:r>
+          </w:p>
+        </w:tc>
+        <w:tc>
+          <w:tcPr>
+            <w:tcW w:type="dxa" w:w="3351"/>
+            <w:tcBorders>
+              <w:top w:val="single" w:sz="4" w:space="0" w:color="auto"/>
+              <w:bottom w:val="single" w:sz="4" w:space="0" w:color="auto"/>
+              <w:left w:val="none" w:sz="0" w:space="0" w:color="auto"/>
+              <w:right w:val="none" w:sz="0" w:space="0" w:color="auto"/>
+            </w:tcBorders>
+          </w:tcPr>
+          <w:p>
+            <w:pPr>
+              <w:spacing w:before="0" w:after="0" w:line="240" w:lineRule="auto"/>
+              <w:jc w:val="center"/>
+            </w:pPr>
+            <w:r/>
+            <w:r>
+              <w:rPr>
+                <w:rFonts w:ascii="Calibri" w:hAnsi="Calibri" w:cs="Calibri"/>
+                <w:sz w:val="16"/>
+              </w:rPr>
+              <w:t>Fast</w:t>
+            </w:r>
+          </w:p>
+        </w:tc>
+      </w:tr>
+      <w:tr>
+        <w:tc>
+          <w:tcPr>
+            <w:tcW w:type="dxa" w:w="3351"/>
+            <w:tcBorders>
+              <w:top w:val="single" w:sz="4" w:space="0" w:color="auto"/>
+              <w:bottom w:val="single" w:sz="4" w:space="0" w:color="auto"/>
+              <w:left w:val="none" w:sz="0" w:space="0" w:color="auto"/>
+              <w:right w:val="none" w:sz="0" w:space="0" w:color="auto"/>
+            </w:tcBorders>
+          </w:tcPr>
+          <w:p>
+            <w:pPr>
+              <w:spacing w:before="0" w:after="0" w:line="240" w:lineRule="auto"/>
+              <w:jc w:val="center"/>
+            </w:pPr>
+            <w:r/>
+            <w:r>
+              <w:rPr>
+                <w:rFonts w:ascii="Calibri" w:hAnsi="Calibri" w:cs="Calibri"/>
+                <w:sz w:val="16"/>
+              </w:rPr>
+              <w:t>B</w:t>
+            </w:r>
+          </w:p>
+        </w:tc>
+        <w:tc>
+          <w:tcPr>
+            <w:tcW w:type="dxa" w:w="3351"/>
+            <w:tcBorders>
+              <w:top w:val="single" w:sz="4" w:space="0" w:color="auto"/>
+              <w:bottom w:val="single" w:sz="4" w:space="0" w:color="auto"/>
+              <w:left w:val="none" w:sz="0" w:space="0" w:color="auto"/>
+              <w:right w:val="none" w:sz="0" w:space="0" w:color="auto"/>
+            </w:tcBorders>
+          </w:tcPr>
+          <w:p>
+            <w:pPr>
+              <w:spacing w:before="0" w:after="0" w:line="240" w:lineRule="auto"/>
+              <w:jc w:val="center"/>
+            </w:pPr>
+            <w:r/>
+            <w:r>
+              <w:rPr>
+                <w:rFonts w:ascii="Calibri" w:hAnsi="Calibri" w:cs="Calibri"/>
+                <w:sz w:val="16"/>
+              </w:rPr>
+              <w:t>92%</w:t>
+            </w:r>
+          </w:p>
+        </w:tc>
+        <w:tc>
+          <w:tcPr>
+            <w:tcW w:type="dxa" w:w="3351"/>
+            <w:tcBorders>
+              <w:top w:val="single" w:sz="4" w:space="0" w:color="auto"/>
+              <w:bottom w:val="single" w:sz="4" w:space="0" w:color="auto"/>
+              <w:left w:val="none" w:sz="0" w:space="0" w:color="auto"/>
+              <w:right w:val="none" w:sz="0" w:space="0" w:color="auto"/>
+            </w:tcBorders>
+          </w:tcPr>
+          <w:p>
+            <w:pPr>
+              <w:spacing w:before="0" w:after="0" w:line="240" w:lineRule="auto"/>
+              <w:jc w:val="center"/>
+            </w:pPr>
+            <w:r/>
+            <w:r>
+              <w:rPr>
+                <w:rFonts w:ascii="Calibri" w:hAnsi="Calibri" w:cs="Calibri"/>
+                <w:sz w:val="16"/>
+              </w:rPr>
+              <w:t>Medium</w:t>
+            </w:r>
+          </w:p>
+        </w:tc>
+      </w:tr>
+      <w:tr>
+        <w:tc>
+          <w:tcPr>
+            <w:tcW w:type="dxa" w:w="3351"/>
+            <w:tcBorders>
+              <w:top w:val="single" w:sz="4" w:space="0" w:color="auto"/>
+              <w:bottom w:val="single" w:sz="4" w:space="0" w:color="auto"/>
+              <w:left w:val="none" w:sz="0" w:space="0" w:color="auto"/>
+              <w:right w:val="none" w:sz="0" w:space="0" w:color="auto"/>
+            </w:tcBorders>
+          </w:tcPr>
+          <w:p>
+            <w:pPr>
+              <w:spacing w:before="0" w:after="0" w:line="240" w:lineRule="auto"/>
+              <w:jc w:val="center"/>
+            </w:pPr>
+            <w:r/>
+            <w:r>
+              <w:rPr>
+                <w:rFonts w:ascii="Calibri" w:hAnsi="Calibri" w:cs="Calibri"/>
+                <w:sz w:val="16"/>
+              </w:rPr>
+              <w:t>C</w:t>
+            </w:r>
+          </w:p>
+        </w:tc>
+        <w:tc>
+          <w:tcPr>
+            <w:tcW w:type="dxa" w:w="3351"/>
+            <w:tcBorders>
+              <w:top w:val="single" w:sz="4" w:space="0" w:color="auto"/>
+              <w:bottom w:val="single" w:sz="4" w:space="0" w:color="auto"/>
+              <w:left w:val="none" w:sz="0" w:space="0" w:color="auto"/>
+              <w:right w:val="none" w:sz="0" w:space="0" w:color="auto"/>
+            </w:tcBorders>
+          </w:tcPr>
+          <w:p>
+            <w:pPr>
+              <w:spacing w:before="0" w:after="0" w:line="240" w:lineRule="auto"/>
+              <w:jc w:val="center"/>
+            </w:pPr>
+            <w:r/>
+            <w:r>
+              <w:rPr>
+                <w:rFonts w:ascii="Calibri" w:hAnsi="Calibri" w:cs="Calibri"/>
+                <w:sz w:val="16"/>
+              </w:rPr>
+              <w:t>90%</w:t>
+            </w:r>
+          </w:p>
+        </w:tc>
+        <w:tc>
+          <w:tcPr>
+            <w:tcW w:type="dxa" w:w="3351"/>
+            <w:tcBorders>
+              <w:top w:val="single" w:sz="4" w:space="0" w:color="auto"/>
+              <w:bottom w:val="single" w:sz="4" w:space="0" w:color="auto"/>
+              <w:left w:val="none" w:sz="0" w:space="0" w:color="auto"/>
+              <w:right w:val="none" w:sz="0" w:space="0" w:color="auto"/>
+            </w:tcBorders>
+          </w:tcPr>
+          <w:p>
+            <w:pPr>
+              <w:spacing w:before="0" w:after="0" w:line="240" w:lineRule="auto"/>
+              <w:jc w:val="center"/>
+            </w:pPr>
+            <w:r/>
+            <w:r>
+              <w:rPr>
+                <w:rFonts w:ascii="Calibri" w:hAnsi="Calibri" w:cs="Calibri"/>
+                <w:sz w:val="16"/>
+              </w:rPr>
+              <w:t>Slow</w:t>
+            </w:r>
+          </w:p>
+        </w:tc>
+      </w:tr>
+    </w:tbl>
+    <w:p>
+      <w:pPr>
+        <w:spacing w:before="60" w:after="160"/>
+      </w:pPr>
+    </w:p>
+    <w:p>
+      <w:pPr>
+        <w:spacing w:before="0" w:after="0" w:line="240" w:lineRule="auto"/>
+        <w:jc w:val="both"/>
+        <w:ind w:firstLine="182"/>
+      </w:pPr>
+      <w:r>
+        <w:rPr>
+          <w:rFonts w:ascii="Calibri" w:hAnsi="Calibri" w:cs="Calibri"/>
+          <w:sz w:val="18"/>
+        </w:rPr>
+        <w:t>Table above should span full width.</w:t>
+      </w:r>
+    </w:p>
+    <w:p>
+      <w:pPr>
+        <w:spacing w:before="0" w:after="0" w:line="240" w:lineRule="auto"/>
+        <w:jc w:val="left"/>
+      </w:pPr>
+      <w:r>
+        <w:rPr>
+          <w:rFonts w:ascii="Calibri" w:hAnsi="Calibri" w:cs="Calibri"/>
+          <w:b/>
+          <w:color w:val="943634"/>
+          <w:sz w:val="22"/>
+        </w:rPr>
+        <w:t>LITERATURE</w:t>
+      </w:r>
+    </w:p>
+    <w:p>
+      <w:pPr>
+        <w:spacing w:before="0" w:after="0" w:line="240" w:lineRule="auto"/>
+        <w:jc w:val="both"/>
+        <w:ind w:firstLine="182"/>
+      </w:pPr>
+      <w:r>
+        <w:rPr>
+          <w:rFonts w:ascii="Calibri" w:hAnsi="Calibri" w:cs="Calibri"/>
+          <w:sz w:val="18"/>
+        </w:rPr>
+        <w:t>Related work.</w:t>
+      </w:r>
     </w:p>
     <w:p>
       <w:pPr>

</xml_diff>